<commit_message>
Les postes d'affectation forment une liste
« - à la réserve légale : 1 536,05 euros ; » et « - au compte report à
nouveau : 29 184,95 euros ; » se suivaient avec l'espacement du texte
courant, alignés sur la marge : trois blocs séparés là où il n'y a qu'une
énumération, et rien ne rattachait les postes à la phrase qui les
annonce.

Ils prennent un retrait de huit millimètres et se resserrent ; la phrase
d'introduction ne se détache plus de sa liste, et le paragraphe suivant
retrouve l'écart d'un bloc.

Le retrait ne tenait pas : la génération l'ôtait de tout paragraphe sans
numérotation Word, règle écrite pour aplatir les articles numérotés des
statuts. Une énumération au tiret en est une aussi, sans porter de
`numPr` : les postes revenaient contre la marge, au même rang que leur
phrase d'introduction. Le tiret de tête suffit à la reconnaître.

Co-Authored-By: Claude Opus 5 (1M context) <noreply@anthropic.com>
Claude-Session: https://claude.ai/code/session_01TjY1giKxUf3SFnaM3d2rmt
</commit_message>
<xml_diff>
--- a/templates/comptes-pv-assemblee.docx
+++ b/templates/comptes-pv-assemblee.docx
@@ -181,7 +181,7 @@
     </w:p>
     <w:p>
       <w:pPr>
-        <w:spacing w:after="200"/>
+        <w:spacing w:after="80"/>
       </w:pPr>
       <w:r>
         <w:t xml:space="preserve">{{#IS_BENEFICE}}L'assemblée générale décide d'affecter le bénéfice de l'exercice, soit {{RESULTAT_FORMATE}} euros{{#IS_REPORT_ANTERIEUR}}, {{REPORT_ANTERIEUR_VERBE}} report à nouveau {{REPORT_ANTERIEUR_QUALITE}} de {{REPORT_ANTERIEUR_FORMATE}} euros, soit un total de {{A_REPARTIR_FORMATE}} euros{{/IS_REPORT_ANTERIEUR}}, de la manière suivante :{{/IS_BENEFICE}}{{#IS_PERTE}}L'assemblée générale décide d'affecter la perte de l'exercice, soit {{RESULTAT_FORMATE}} euros, au compte « report à nouveau », qui est ainsi porté à {{AFF_REPORT}} euros.{{/IS_PERTE}}</w:t>
@@ -197,7 +197,8 @@
     </w:p>
     <w:p>
       <w:pPr>
-        <w:spacing w:after="200"/>
+        <w:spacing w:after="80"/>
+        <w:ind w:left="454"/>
       </w:pPr>
       <w:r>
         <w:t xml:space="preserve">- {{LIBELLE}} : {{MONTANT}} euros{{SUITE}} ;</w:t>
@@ -213,7 +214,7 @@
     </w:p>
     <w:p>
       <w:pPr>
-        <w:spacing w:after="200"/>
+        <w:spacing w:before="240" w:after="200"/>
       </w:pPr>
       <w:r>
         <w:t xml:space="preserve">{{#IS_RESERVE_LEGALE}}La dotation à la réserve légale est celle qu'impose l'article L. 232-10 du code de commerce : un vingtième du bénéfice diminué des pertes antérieures, jusqu'à ce que la réserve atteigne le dixième du capital social, soit {{RESERVE_PLAFOND_FORMATE}} euros.{{/IS_RESERVE_LEGALE}}</w:t>

</xml_diff>